<commit_message>
SEQUOIADBMAINSTREAM-1957: replica log archiving and replay update Story-ReplicaLogArchivingAndReplay.docx
git-svn-id: http://192.168.20.11/sequoiadb/trunk@25375 6121f079-4a18-41d3-8c30-8870a322f2c2
</commit_message>
<xml_diff>
--- a/internal_doc/03.开发设计/Story-ReplicaLogArchivingAndReplay.docx
+++ b/internal_doc/03.开发设计/Story-ReplicaLogArchivingAndReplay.docx
@@ -526,6 +526,7 @@
         </w:numPr>
         <w:ind w:firstLineChars="0"/>
         <w:rPr>
+          <w:rFonts w:hint="eastAsia"/>
           <w:color w:val="000000" w:themeColor="text1"/>
         </w:rPr>
       </w:pPr>
@@ -534,7 +535,34 @@
           <w:rFonts w:hint="eastAsia"/>
           <w:color w:val="000000" w:themeColor="text1"/>
         </w:rPr>
-        <w:t>持续监控归档目录并重放。</w:t>
+        <w:t>持续监控归档目录并重放；</w:t>
+      </w:r>
+    </w:p>
+    <w:p>
+      <w:pPr>
+        <w:pStyle w:val="ListParagraph"/>
+        <w:numPr>
+          <w:ilvl w:val="0"/>
+          <w:numId w:val="22"/>
+        </w:numPr>
+        <w:ind w:firstLineChars="0"/>
+        <w:rPr>
+          <w:color w:val="000000" w:themeColor="text1"/>
+        </w:rPr>
+      </w:pPr>
+      <w:r>
+        <w:rPr>
+          <w:rFonts w:hint="eastAsia"/>
+          <w:color w:val="000000" w:themeColor="text1"/>
+        </w:rPr>
+        <w:t>LSN</w:t>
+      </w:r>
+      <w:r>
+        <w:rPr>
+          <w:rFonts w:hint="eastAsia"/>
+          <w:color w:val="000000" w:themeColor="text1"/>
+        </w:rPr>
+        <w:t>不连续时报错退出。</w:t>
       </w:r>
     </w:p>
     <w:p>
@@ -1471,7 +1499,14 @@
               <w:rPr>
                 <w:rFonts w:eastAsiaTheme="minorEastAsia" w:hint="eastAsia"/>
               </w:rPr>
-              <w:t>表示不过期</w:t>
+              <w:t>表示</w:t>
+            </w:r>
+            <w:r>
+              <w:rPr>
+                <w:rFonts w:eastAsiaTheme="minorEastAsia" w:hint="eastAsia"/>
+              </w:rPr>
+              <w:lastRenderedPageBreak/>
+              <w:t>不过期</w:t>
             </w:r>
             <w:r>
               <w:rPr>
@@ -2442,12 +2477,21 @@
           <w:p>
             <w:pPr>
               <w:ind w:left="0"/>
+              <w:rPr>
+                <w:rFonts w:eastAsiaTheme="minorEastAsia"/>
+              </w:rPr>
             </w:pPr>
             <w:r>
               <w:rPr>
                 <w:rFonts w:hint="eastAsia"/>
               </w:rPr>
-              <w:t>归档路径</w:t>
+              <w:t>归档</w:t>
+            </w:r>
+            <w:r>
+              <w:rPr>
+                <w:rFonts w:eastAsiaTheme="minorEastAsia" w:hint="eastAsia"/>
+              </w:rPr>
+              <w:t>目录</w:t>
             </w:r>
           </w:p>
         </w:tc>
@@ -2991,7 +3035,7 @@
               <w:rPr>
                 <w:rFonts w:eastAsiaTheme="minorEastAsia" w:hint="eastAsia"/>
               </w:rPr>
-              <w:t>hold</w:t>
+              <w:t>watch</w:t>
             </w:r>
           </w:p>
         </w:tc>
@@ -3010,12 +3054,6 @@
               <w:rPr>
                 <w:rFonts w:eastAsiaTheme="minorEastAsia" w:hint="eastAsia"/>
               </w:rPr>
-              <w:t>保持不退出，</w:t>
-            </w:r>
-            <w:r>
-              <w:rPr>
-                <w:rFonts w:eastAsiaTheme="minorEastAsia" w:hint="eastAsia"/>
-              </w:rPr>
               <w:t>持续</w:t>
             </w:r>
             <w:r>
@@ -3083,7 +3121,288 @@
           <w:p>
             <w:pPr>
               <w:ind w:left="0"/>
-            </w:pPr>
+              <w:rPr>
+                <w:rFonts w:eastAsiaTheme="minorEastAsia" w:hint="eastAsia"/>
+              </w:rPr>
+            </w:pPr>
+            <w:r>
+              <w:rPr>
+                <w:rFonts w:eastAsiaTheme="minorEastAsia" w:hint="eastAsia"/>
+              </w:rPr>
+              <w:t>path</w:t>
+            </w:r>
+            <w:r>
+              <w:rPr>
+                <w:rFonts w:eastAsiaTheme="minorEastAsia" w:hint="eastAsia"/>
+              </w:rPr>
+              <w:t>为目录时</w:t>
+            </w:r>
+            <w:r>
+              <w:rPr>
+                <w:rFonts w:eastAsiaTheme="minorEastAsia" w:hint="eastAsia"/>
+              </w:rPr>
+              <w:t>有效</w:t>
+            </w:r>
+          </w:p>
+        </w:tc>
+      </w:tr>
+      <w:tr>
+        <w:tc>
+          <w:tcPr>
+            <w:tcW w:w="1242" w:type="dxa"/>
+          </w:tcPr>
+          <w:p>
+            <w:pPr>
+              <w:ind w:left="0"/>
+              <w:rPr>
+                <w:rFonts w:eastAsiaTheme="minorEastAsia" w:hint="eastAsia"/>
+              </w:rPr>
+            </w:pPr>
+            <w:r>
+              <w:rPr>
+                <w:rFonts w:eastAsiaTheme="minorEastAsia" w:hint="eastAsia"/>
+              </w:rPr>
+              <w:t>daemon</w:t>
+            </w:r>
+          </w:p>
+        </w:tc>
+        <w:tc>
+          <w:tcPr>
+            <w:tcW w:w="1985" w:type="dxa"/>
+          </w:tcPr>
+          <w:p>
+            <w:pPr>
+              <w:ind w:left="0"/>
+              <w:rPr>
+                <w:rFonts w:eastAsiaTheme="minorEastAsia" w:hint="eastAsia"/>
+              </w:rPr>
+            </w:pPr>
+            <w:r>
+              <w:rPr>
+                <w:rFonts w:eastAsiaTheme="minorEastAsia" w:hint="eastAsia"/>
+              </w:rPr>
+              <w:t>在</w:t>
+            </w:r>
+            <w:r>
+              <w:rPr>
+                <w:rFonts w:eastAsiaTheme="minorEastAsia" w:hint="eastAsia"/>
+              </w:rPr>
+              <w:t>后台运行</w:t>
+            </w:r>
+          </w:p>
+        </w:tc>
+        <w:tc>
+          <w:tcPr>
+            <w:tcW w:w="1134" w:type="dxa"/>
+          </w:tcPr>
+          <w:p>
+            <w:pPr>
+              <w:ind w:left="0"/>
+              <w:rPr>
+                <w:rFonts w:eastAsiaTheme="minorEastAsia" w:hint="eastAsia"/>
+              </w:rPr>
+            </w:pPr>
+            <w:r>
+              <w:rPr>
+                <w:rFonts w:eastAsiaTheme="minorEastAsia" w:hint="eastAsia"/>
+              </w:rPr>
+              <w:t>bool</w:t>
+            </w:r>
+          </w:p>
+        </w:tc>
+        <w:tc>
+          <w:tcPr>
+            <w:tcW w:w="1843" w:type="dxa"/>
+          </w:tcPr>
+          <w:p>
+            <w:pPr>
+              <w:ind w:left="0"/>
+              <w:rPr>
+                <w:rFonts w:eastAsiaTheme="minorEastAsia" w:hint="eastAsia"/>
+              </w:rPr>
+            </w:pPr>
+            <w:r>
+              <w:rPr>
+                <w:rFonts w:eastAsiaTheme="minorEastAsia" w:hint="eastAsia"/>
+              </w:rPr>
+              <w:t>false</w:t>
+            </w:r>
+          </w:p>
+        </w:tc>
+        <w:tc>
+          <w:tcPr>
+            <w:tcW w:w="2412" w:type="dxa"/>
+          </w:tcPr>
+          <w:p>
+            <w:pPr>
+              <w:ind w:left="0"/>
+              <w:rPr>
+                <w:rFonts w:eastAsiaTheme="minorEastAsia" w:hint="eastAsia"/>
+              </w:rPr>
+            </w:pPr>
+            <w:r>
+              <w:rPr>
+                <w:rFonts w:eastAsiaTheme="minorEastAsia" w:hint="eastAsia"/>
+              </w:rPr>
+              <w:t>kill -15 &lt;pid&gt;</w:t>
+            </w:r>
+            <w:r>
+              <w:rPr>
+                <w:rFonts w:eastAsiaTheme="minorEastAsia" w:hint="eastAsia"/>
+              </w:rPr>
+              <w:t>可以使后台进程</w:t>
+            </w:r>
+            <w:r>
+              <w:rPr>
+                <w:rFonts w:eastAsiaTheme="minorEastAsia" w:hint="eastAsia"/>
+              </w:rPr>
+              <w:t>正确</w:t>
+            </w:r>
+            <w:r>
+              <w:rPr>
+                <w:rFonts w:eastAsiaTheme="minorEastAsia" w:hint="eastAsia"/>
+              </w:rPr>
+              <w:t>退出</w:t>
+            </w:r>
+          </w:p>
+        </w:tc>
+      </w:tr>
+      <w:tr>
+        <w:tc>
+          <w:tcPr>
+            <w:tcW w:w="1242" w:type="dxa"/>
+          </w:tcPr>
+          <w:p>
+            <w:pPr>
+              <w:ind w:left="0"/>
+              <w:rPr>
+                <w:rFonts w:eastAsiaTheme="minorEastAsia" w:hint="eastAsia"/>
+              </w:rPr>
+            </w:pPr>
+            <w:r>
+              <w:rPr>
+                <w:rFonts w:eastAsiaTheme="minorEastAsia" w:hint="eastAsia"/>
+              </w:rPr>
+              <w:t>status</w:t>
+            </w:r>
+          </w:p>
+        </w:tc>
+        <w:tc>
+          <w:tcPr>
+            <w:tcW w:w="1985" w:type="dxa"/>
+          </w:tcPr>
+          <w:p>
+            <w:pPr>
+              <w:ind w:left="0"/>
+              <w:rPr>
+                <w:rFonts w:eastAsiaTheme="minorEastAsia" w:hint="eastAsia"/>
+              </w:rPr>
+            </w:pPr>
+            <w:r>
+              <w:rPr>
+                <w:rFonts w:eastAsiaTheme="minorEastAsia" w:hint="eastAsia"/>
+              </w:rPr>
+              <w:t>指定状态文件</w:t>
+            </w:r>
+          </w:p>
+        </w:tc>
+        <w:tc>
+          <w:tcPr>
+            <w:tcW w:w="1134" w:type="dxa"/>
+          </w:tcPr>
+          <w:p>
+            <w:pPr>
+              <w:ind w:left="0"/>
+              <w:rPr>
+                <w:rFonts w:eastAsiaTheme="minorEastAsia" w:hint="eastAsia"/>
+              </w:rPr>
+            </w:pPr>
+            <w:r>
+              <w:rPr>
+                <w:rFonts w:eastAsiaTheme="minorEastAsia" w:hint="eastAsia"/>
+              </w:rPr>
+              <w:t>string</w:t>
+            </w:r>
+          </w:p>
+        </w:tc>
+        <w:tc>
+          <w:tcPr>
+            <w:tcW w:w="1843" w:type="dxa"/>
+          </w:tcPr>
+          <w:p>
+            <w:pPr>
+              <w:ind w:left="0"/>
+              <w:rPr>
+                <w:rFonts w:eastAsiaTheme="minorEastAsia" w:hint="eastAsia"/>
+              </w:rPr>
+            </w:pPr>
+            <w:r>
+              <w:rPr>
+                <w:rFonts w:eastAsiaTheme="minorEastAsia" w:hint="eastAsia"/>
+              </w:rPr>
+              <w:t>-</w:t>
+            </w:r>
+          </w:p>
+        </w:tc>
+        <w:tc>
+          <w:tcPr>
+            <w:tcW w:w="2412" w:type="dxa"/>
+          </w:tcPr>
+          <w:p>
+            <w:pPr>
+              <w:ind w:left="0"/>
+              <w:rPr>
+                <w:rFonts w:eastAsiaTheme="minorEastAsia" w:hint="eastAsia"/>
+              </w:rPr>
+            </w:pPr>
+            <w:r>
+              <w:rPr>
+                <w:rFonts w:eastAsiaTheme="minorEastAsia" w:hint="eastAsia"/>
+              </w:rPr>
+              <w:t>状态文件会存储重放的状态信息，</w:t>
+            </w:r>
+            <w:r>
+              <w:rPr>
+                <w:rFonts w:eastAsiaTheme="minorEastAsia" w:hint="eastAsia"/>
+              </w:rPr>
+              <w:t>首次指定时重放工具会生成</w:t>
+            </w:r>
+            <w:r>
+              <w:rPr>
+                <w:rFonts w:eastAsiaTheme="minorEastAsia" w:hint="eastAsia"/>
+              </w:rPr>
+              <w:t>该</w:t>
+            </w:r>
+            <w:r>
+              <w:rPr>
+                <w:rFonts w:eastAsiaTheme="minorEastAsia" w:hint="eastAsia"/>
+              </w:rPr>
+              <w:t>文件</w:t>
+            </w:r>
+            <w:r>
+              <w:rPr>
+                <w:rFonts w:eastAsiaTheme="minorEastAsia" w:hint="eastAsia"/>
+              </w:rPr>
+              <w:t>。</w:t>
+            </w:r>
+            <w:r>
+              <w:rPr>
+                <w:rFonts w:eastAsiaTheme="minorEastAsia" w:hint="eastAsia"/>
+              </w:rPr>
+              <w:t>重放工具退出后，</w:t>
+            </w:r>
+            <w:r>
+              <w:rPr>
+                <w:rFonts w:eastAsiaTheme="minorEastAsia" w:hint="eastAsia"/>
+              </w:rPr>
+              <w:t>通过指定状态文件可以从上次</w:t>
+            </w:r>
+            <w:r>
+              <w:rPr>
+                <w:rFonts w:eastAsiaTheme="minorEastAsia" w:hint="eastAsia"/>
+              </w:rPr>
+              <w:t>退出的地方继续重放。</w:t>
+            </w:r>
           </w:p>
         </w:tc>
       </w:tr>
@@ -3144,6 +3463,7 @@
               <w:rPr>
                 <w:rFonts w:eastAsiaTheme="minorEastAsia" w:hint="eastAsia"/>
               </w:rPr>
+              <w:lastRenderedPageBreak/>
               <w:t>字段</w:t>
             </w:r>
           </w:p>
@@ -3663,7 +3983,6 @@
               <w:rPr>
                 <w:rFonts w:eastAsiaTheme="minorEastAsia" w:hint="eastAsia"/>
               </w:rPr>
-              <w:lastRenderedPageBreak/>
               <w:t>集合名”</w:t>
             </w:r>
             <w:r>
@@ -3697,7 +4016,6 @@
               <w:rPr>
                 <w:rFonts w:eastAsiaTheme="minorEastAsia" w:hint="eastAsia"/>
               </w:rPr>
-              <w:lastRenderedPageBreak/>
               <w:t>Excl</w:t>
             </w:r>
             <w:r>
@@ -4295,9 +4613,6 @@
     <w:p>
       <w:pPr>
         <w:ind w:left="0"/>
-        <w:rPr>
-          <w:rFonts w:hint="eastAsia"/>
-        </w:rPr>
       </w:pPr>
       <w:r>
         <w:rPr>
@@ -4415,7 +4730,7 @@
               <w:ind w:left="0"/>
               <w:jc w:val="center"/>
               <w:rPr>
-                <w:rFonts w:eastAsiaTheme="minorEastAsia" w:hint="eastAsia"/>
+                <w:rFonts w:eastAsiaTheme="minorEastAsia"/>
                 <w:b/>
               </w:rPr>
             </w:pPr>
@@ -4459,7 +4774,7 @@
               <w:ind w:left="0"/>
               <w:jc w:val="center"/>
               <w:rPr>
-                <w:rFonts w:eastAsiaTheme="minorEastAsia" w:hint="eastAsia"/>
+                <w:rFonts w:eastAsiaTheme="minorEastAsia"/>
                 <w:b/>
               </w:rPr>
             </w:pPr>
@@ -4500,9 +4815,6 @@
           <w:p>
             <w:pPr>
               <w:ind w:left="0"/>
-              <w:rPr>
-                <w:rFonts w:hint="eastAsia"/>
-              </w:rPr>
             </w:pPr>
             <w:r>
               <w:rPr>
@@ -4538,9 +4850,6 @@
           <w:p>
             <w:pPr>
               <w:ind w:left="0"/>
-              <w:rPr>
-                <w:rFonts w:hint="eastAsia"/>
-              </w:rPr>
             </w:pPr>
           </w:p>
         </w:tc>
@@ -4572,9 +4881,6 @@
           <w:p>
             <w:pPr>
               <w:ind w:left="0"/>
-              <w:rPr>
-                <w:rFonts w:hint="eastAsia"/>
-              </w:rPr>
             </w:pPr>
             <w:r>
               <w:rPr>
@@ -4610,9 +4916,6 @@
           <w:p>
             <w:pPr>
               <w:ind w:left="0"/>
-              <w:rPr>
-                <w:rFonts w:hint="eastAsia"/>
-              </w:rPr>
             </w:pPr>
           </w:p>
         </w:tc>
@@ -4644,9 +4947,6 @@
           <w:p>
             <w:pPr>
               <w:ind w:left="0"/>
-              <w:rPr>
-                <w:rFonts w:hint="eastAsia"/>
-              </w:rPr>
             </w:pPr>
             <w:r>
               <w:rPr>
@@ -4682,9 +4982,6 @@
           <w:p>
             <w:pPr>
               <w:ind w:left="0"/>
-              <w:rPr>
-                <w:rFonts w:hint="eastAsia"/>
-              </w:rPr>
             </w:pPr>
           </w:p>
         </w:tc>
@@ -4716,9 +5013,6 @@
           <w:p>
             <w:pPr>
               <w:ind w:left="0"/>
-              <w:rPr>
-                <w:rFonts w:hint="eastAsia"/>
-              </w:rPr>
             </w:pPr>
             <w:r>
               <w:rPr>
@@ -4760,9 +5054,6 @@
           <w:p>
             <w:pPr>
               <w:ind w:left="0"/>
-              <w:rPr>
-                <w:rFonts w:hint="eastAsia"/>
-              </w:rPr>
             </w:pPr>
           </w:p>
         </w:tc>
@@ -4794,9 +5085,6 @@
           <w:p>
             <w:pPr>
               <w:ind w:left="0"/>
-              <w:rPr>
-                <w:rFonts w:hint="eastAsia"/>
-              </w:rPr>
             </w:pPr>
             <w:r>
               <w:rPr>
@@ -4833,7 +5121,7 @@
             <w:pPr>
               <w:ind w:left="0"/>
               <w:rPr>
-                <w:rFonts w:eastAsiaTheme="minorEastAsia" w:hint="eastAsia"/>
+                <w:rFonts w:eastAsiaTheme="minorEastAsia"/>
               </w:rPr>
             </w:pPr>
             <w:r>
@@ -4872,9 +5160,6 @@
           <w:p>
             <w:pPr>
               <w:ind w:left="0"/>
-              <w:rPr>
-                <w:rFonts w:hint="eastAsia"/>
-              </w:rPr>
             </w:pPr>
             <w:r>
               <w:rPr>
@@ -4910,9 +5195,6 @@
           <w:p>
             <w:pPr>
               <w:ind w:left="0"/>
-              <w:rPr>
-                <w:rFonts w:hint="eastAsia"/>
-              </w:rPr>
             </w:pPr>
             <w:r>
               <w:rPr>
@@ -4950,9 +5232,6 @@
           <w:p>
             <w:pPr>
               <w:ind w:left="0"/>
-              <w:rPr>
-                <w:rFonts w:hint="eastAsia"/>
-              </w:rPr>
             </w:pPr>
             <w:r>
               <w:rPr>
@@ -4988,9 +5267,6 @@
           <w:p>
             <w:pPr>
               <w:ind w:left="0"/>
-              <w:rPr>
-                <w:rFonts w:hint="eastAsia"/>
-              </w:rPr>
             </w:pPr>
             <w:r>
               <w:rPr>
@@ -5028,9 +5304,6 @@
           <w:p>
             <w:pPr>
               <w:ind w:left="0"/>
-              <w:rPr>
-                <w:rFonts w:hint="eastAsia"/>
-              </w:rPr>
             </w:pPr>
             <w:r>
               <w:rPr>
@@ -5066,9 +5339,6 @@
           <w:p>
             <w:pPr>
               <w:ind w:left="0"/>
-              <w:rPr>
-                <w:rFonts w:hint="eastAsia"/>
-              </w:rPr>
             </w:pPr>
             <w:r>
               <w:rPr>
@@ -5106,9 +5376,6 @@
           <w:p>
             <w:pPr>
               <w:ind w:left="0"/>
-              <w:rPr>
-                <w:rFonts w:hint="eastAsia"/>
-              </w:rPr>
             </w:pPr>
             <w:r>
               <w:rPr>
@@ -5144,9 +5411,6 @@
           <w:p>
             <w:pPr>
               <w:ind w:left="0"/>
-              <w:rPr>
-                <w:rFonts w:hint="eastAsia"/>
-              </w:rPr>
             </w:pPr>
             <w:r>
               <w:rPr>
@@ -5184,9 +5448,6 @@
           <w:p>
             <w:pPr>
               <w:ind w:left="0"/>
-              <w:rPr>
-                <w:rFonts w:hint="eastAsia"/>
-              </w:rPr>
             </w:pPr>
             <w:r>
               <w:rPr>
@@ -5222,9 +5483,6 @@
           <w:p>
             <w:pPr>
               <w:ind w:left="0"/>
-              <w:rPr>
-                <w:rFonts w:hint="eastAsia"/>
-              </w:rPr>
             </w:pPr>
             <w:r>
               <w:rPr>
@@ -5262,9 +5520,6 @@
           <w:p>
             <w:pPr>
               <w:ind w:left="0"/>
-              <w:rPr>
-                <w:rFonts w:hint="eastAsia"/>
-              </w:rPr>
             </w:pPr>
             <w:r>
               <w:rPr>
@@ -5306,9 +5561,6 @@
           <w:p>
             <w:pPr>
               <w:ind w:left="0"/>
-              <w:rPr>
-                <w:rFonts w:hint="eastAsia"/>
-              </w:rPr>
             </w:pPr>
             <w:r>
               <w:rPr>
@@ -5346,9 +5598,6 @@
           <w:p>
             <w:pPr>
               <w:ind w:left="0"/>
-              <w:rPr>
-                <w:rFonts w:hint="eastAsia"/>
-              </w:rPr>
             </w:pPr>
             <w:r>
               <w:rPr>
@@ -5390,9 +5639,6 @@
           <w:p>
             <w:pPr>
               <w:ind w:left="0"/>
-              <w:rPr>
-                <w:rFonts w:hint="eastAsia"/>
-              </w:rPr>
             </w:pPr>
             <w:r>
               <w:rPr>
@@ -5430,9 +5676,6 @@
           <w:p>
             <w:pPr>
               <w:ind w:left="0"/>
-              <w:rPr>
-                <w:rFonts w:hint="eastAsia"/>
-              </w:rPr>
             </w:pPr>
             <w:r>
               <w:rPr>
@@ -5474,9 +5717,6 @@
           <w:p>
             <w:pPr>
               <w:ind w:left="0"/>
-              <w:rPr>
-                <w:rFonts w:hint="eastAsia"/>
-              </w:rPr>
             </w:pPr>
             <w:r>
               <w:rPr>
@@ -5514,9 +5754,6 @@
           <w:p>
             <w:pPr>
               <w:ind w:left="0"/>
-              <w:rPr>
-                <w:rFonts w:hint="eastAsia"/>
-              </w:rPr>
             </w:pPr>
             <w:r>
               <w:rPr>
@@ -5552,9 +5789,6 @@
           <w:p>
             <w:pPr>
               <w:ind w:left="0"/>
-              <w:rPr>
-                <w:rFonts w:hint="eastAsia"/>
-              </w:rPr>
             </w:pPr>
             <w:r>
               <w:rPr>
@@ -6657,9 +6891,6 @@
     <w:p>
       <w:pPr>
         <w:ind w:left="0"/>
-        <w:rPr>
-          <w:rFonts w:hint="eastAsia"/>
-        </w:rPr>
       </w:pPr>
       <w:r>
         <w:rPr>
@@ -7022,7 +7253,6 @@
         <w:rPr>
           <w:rFonts w:hint="eastAsia"/>
         </w:rPr>
-        <w:lastRenderedPageBreak/>
         <w:t>}</w:t>
       </w:r>
     </w:p>
@@ -7932,7 +8162,7 @@
           <v:shape id="_x0000_i1025" type="#_x0000_t75" style="width:419.65pt;height:576.9pt" o:ole="">
             <v:imagedata r:id="rId5" o:title=""/>
           </v:shape>
-          <o:OLEObject Type="Embed" ProgID="Visio.Drawing.11" ShapeID="_x0000_i1025" DrawAspect="Content" ObjectID="_1535969552" r:id="rId6"/>
+          <o:OLEObject Type="Embed" ProgID="Visio.Drawing.11" ShapeID="_x0000_i1025" DrawAspect="Content" ObjectID="_1539070151" r:id="rId6"/>
         </w:object>
       </w:r>
     </w:p>
@@ -8070,7 +8300,14 @@
         <w:rPr>
           <w:rFonts w:hint="eastAsia"/>
         </w:rPr>
-        <w:t>先重放</w:t>
+        <w:t>先重</w:t>
+      </w:r>
+      <w:r>
+        <w:rPr>
+          <w:rFonts w:hint="eastAsia"/>
+        </w:rPr>
+        <w:lastRenderedPageBreak/>
+        <w:t>放</w:t>
       </w:r>
       <w:r>
         <w:rPr>
@@ -8140,7 +8377,6 @@
         <w:rPr>
           <w:rFonts w:hint="eastAsia"/>
         </w:rPr>
-        <w:lastRenderedPageBreak/>
         <w:t>当回放过程中出现问题时，立即中断操作。已经处理过的日志不做回滚。</w:t>
       </w:r>
     </w:p>
@@ -9470,7 +9706,14 @@
               <w:rPr>
                 <w:rFonts w:eastAsiaTheme="minorEastAsia" w:hint="eastAsia"/>
               </w:rPr>
-              <w:t>日志时发生全量同步</w:t>
+              <w:t>日志时发生</w:t>
+            </w:r>
+            <w:r>
+              <w:rPr>
+                <w:rFonts w:eastAsiaTheme="minorEastAsia" w:hint="eastAsia"/>
+              </w:rPr>
+              <w:lastRenderedPageBreak/>
+              <w:t>全量同步</w:t>
             </w:r>
           </w:p>
         </w:tc>
@@ -9500,6 +9743,7 @@
               <w:rPr>
                 <w:rFonts w:eastAsiaTheme="minorEastAsia" w:hint="eastAsia"/>
               </w:rPr>
+              <w:lastRenderedPageBreak/>
               <w:t>创建复制组，其中一个备节点配置参数</w:t>
             </w:r>
             <w:r>
@@ -9543,6 +9787,7 @@
               <w:rPr>
                 <w:rFonts w:eastAsiaTheme="minorEastAsia" w:hint="eastAsia"/>
               </w:rPr>
+              <w:lastRenderedPageBreak/>
               <w:t>对数据库进行插入、更新、删除操作；</w:t>
             </w:r>
           </w:p>
@@ -9562,7 +9807,6 @@
               <w:rPr>
                 <w:rFonts w:eastAsiaTheme="minorEastAsia" w:hint="eastAsia"/>
               </w:rPr>
-              <w:lastRenderedPageBreak/>
               <w:t>操作过程中强杀</w:t>
             </w:r>
             <w:r>
@@ -9629,7 +9873,14 @@
                 <w:rFonts w:eastAsiaTheme="minorEastAsia" w:hint="eastAsia"/>
               </w:rPr>
               <w:lastRenderedPageBreak/>
-              <w:t>日志正常归档，独立节点与复制组的数据一致。</w:t>
+              <w:t>日志正常归档，独立节点与复制</w:t>
+            </w:r>
+            <w:r>
+              <w:rPr>
+                <w:rFonts w:eastAsiaTheme="minorEastAsia" w:hint="eastAsia"/>
+              </w:rPr>
+              <w:lastRenderedPageBreak/>
+              <w:t>组的数据一致。</w:t>
             </w:r>
           </w:p>
         </w:tc>

</xml_diff>